<commit_message>
Report: new title page
</commit_message>
<xml_diff>
--- a/report/Freight_Rate_Report.docx
+++ b/report/Freight_Rate_Report.docx
@@ -4,29 +4,42 @@
   <w:body>
     <w:p>
       <w:pPr>
-        <w:spacing w:before="1200" w:after="120"/>
+        <w:spacing w:before="2400" w:after="160"/>
       </w:pPr>
       <w:r>
         <w:rPr>
           <w:b/>
           <w:bCs/>
-          <w:sz w:val="56"/>
-          <w:szCs w:val="56"/>
+          <w:sz w:val="80"/>
+          <w:szCs w:val="80"/>
         </w:rPr>
         <w:t xml:space="preserve">Freight Rate Prediction</w:t>
       </w:r>
     </w:p>
     <w:p>
       <w:pPr>
-        <w:spacing w:after="100"/>
+        <w:spacing w:after="120"/>
       </w:pPr>
       <w:r>
         <w:rPr>
           <w:color w:val="52514e"/>
-          <w:sz w:val="30"/>
-          <w:szCs w:val="30"/>
+          <w:sz w:val="36"/>
+          <w:szCs w:val="36"/>
         </w:rPr>
         <w:t xml:space="preserve">Validation approach, data split, model and results</w:t>
+      </w:r>
+    </w:p>
+    <w:p>
+      <w:pPr>
+        <w:spacing w:after="160"/>
+      </w:pPr>
+      <w:r>
+        <w:rPr>
+          <w:color w:val="52514e"/>
+          <w:sz w:val="24"/>
+          <w:szCs w:val="24"/>
+        </w:rPr>
+        <w:t xml:space="preserve">12,000 loads predicted   |   1.70% forward-fold error   |   23 features</w:t>
       </w:r>
     </w:p>
     <w:p>
@@ -43,7 +56,7 @@
     </w:p>
     <w:p>
       <w:pPr>
-        <w:spacing w:after="60"/>
+        <w:spacing w:before="7600" w:after="60"/>
       </w:pPr>
       <w:r>
         <w:rPr>
@@ -55,7 +68,7 @@
     </w:p>
     <w:p>
       <w:pPr>
-        <w:spacing w:after="600"/>
+        <w:spacing w:after="0"/>
       </w:pPr>
       <w:r>
         <w:rPr>
@@ -63,6 +76,9 @@
           <w:szCs w:val="24"/>
         </w:rPr>
         <w:t xml:space="preserve">October 2026</w:t>
+      </w:r>
+      <w:r>
+        <w:br w:type="page"/>
       </w:r>
     </w:p>
     <w:p>

</xml_diff>